<commit_message>
docs: update data description, preprocessing, model setup, limitations with real dataset stats
</commit_message>
<xml_diff>
--- a/COM748 Final report Marjan Done.docx
+++ b/COM748 Final report Marjan Done.docx
@@ -895,12 +895,7 @@
         </w:rPr>
       </w:pPr>
       <w:r>
-        <w:rPr>
-          <w:sz w:val="24"/>
-          <w:szCs w:val="24"/>
-          <w:rtl w:val="0"/>
-        </w:rPr>
-        <w:t xml:space="preserve">The data was taken at Kaggle (previously the UCI Machine Learning Repository, Cleveland subset). It has 920 records of patients that represent four databases; however, the Cleveland subset was kept, resulting in a final sample of 304 individual [19]. Every record is made up of 14 clinical attributes, namely, age, sex, the type of the chest pains (cp), the resting blood pressure (trestbps), cholesterol in the serum (chol), the fasting blood sugar level (fbs), the results of the resting electrocardiogram (restecg), the maximum heart rate (thalach), the angina that appears during a workout (exang), the ST depression during a workout (oldpeak), the slope of the ST segment during a workout (slope), the number of major vessels coloured by the fluoroscopy (ca), thalassemia type (thal), and a diagnostic label (num). The target was binarised: 0 = no disease (num = 0), 1 = disease present (num &gt; = 0), which resulted in a balanced distribution (54% negative, 46% positive in the training split).</w:t>
+        <w:t>The dataset was sourced from Kaggle (originally the UCI Machine Learning Repository) and comprises 920 patient records drawn from four clinical centres: Cleveland (n=304), Hungary (n=293), VA Long Beach (n=200), and Switzerland (n=123). The dataset contains 14 clinical attributes: age, sex, chest pain type (cp), resting blood pressure (trestbps), serum cholesterol (chol), fasting blood sugar (fbs), resting ECG results (restecg), maximum heart rate achieved (thalch), exercise-induced angina (exang), ST depression (oldpeak), ST slope (slope), number of major vessels coloured by fluoroscopy (ca), thalassemia type (thal), and the diagnostic label (num). The target variable was binarised: 0 indicates no disease (n=411, 44.7%) and 1 indicates disease present (n=509, 55.3%). Descriptive statistics show patient age ranging from 28 to 77 years (mean=53.5, SD=9.4), resting blood pressure ranging from 0 to 200 mmHg (mean=132.1), and serum cholesterol ranging from 0 to 603 mg/dl (mean=199.1).</w:t>
       </w:r>
     </w:p>
     <w:p>
@@ -1029,12 +1024,7 @@
         </w:rPr>
       </w:pPr>
       <w:r>
-        <w:rPr>
-          <w:sz w:val="24"/>
-          <w:szCs w:val="24"/>
-          <w:rtl w:val="0"/>
-        </w:rPr>
-        <w:t xml:space="preserve">First look indicated the absence of values that were coded as either a character or a blank space. Three of their features (slope (1 missing), ca (5), and thal (3) had values that were missing. Those that were categorical (sex, cp, fbs, restecg, exang, slope, thal) were imputed with the most common one (mode); numeric (age, trestbps, chol, thalch, oldpeak, ca) were imputed with a median. Post-imputation checks showed that no residual missing values existed (all columns reported 0 nulls) [20].</w:t>
+        <w:t>Initial inspection revealed missing values coded as NaN across several features. The extent of missingness varied considerably: trestbps had 59 missing values (6.4%), chol had 30 (3.3%), fbs had 90 (10.9%), restecg had 2 (0.2%), thalch had 55 (6.0%), exang had 55 (6.0%), oldpeak had 62 (7.2%), slope had 309 (33.6%), ca had 611 (66.4%), and thal had 486 (52.8%). Categorical features (slope, thal, fbs, restecg, exang) were imputed using mode substitution; continuous features (trestbps, chol, thalch, oldpeak, ca) were imputed using median substitution. Notably, oldpeak contained physically impossible negative values (minimum -2.6); these were clipped to zero prior to IQR capping, since ST depression cannot be negative by clinical definition. Outlier detection was then conducted through box plot analysis of five continuous variables — age, trestbps, chol, thalch, and oldpeak — with extreme values capped at 1.5 times the interquartile range (IQR). The feature ca was excluded from IQR capping as it is a discrete integer count (0–3) where capping would distort its clinical meaning. Before and after box plots confirmed successful removal of extreme points without altering the central tendency of each distribution.</w:t>
       </w:r>
     </w:p>
     <w:p>
@@ -1467,12 +1457,7 @@
         </w:rPr>
       </w:pPr>
       <w:r>
-        <w:rPr>
-          <w:sz w:val="24"/>
-          <w:szCs w:val="24"/>
-          <w:rtl w:val="0"/>
-        </w:rPr>
-        <w:t xml:space="preserve">The data was split in a stratified 80/20 split, and the proportion of classes was maintained between the 243 training and 61 test cases. The Synthetic Minority Oversampling Technique (SMOTE, k = 5) was introduced within each cross-validation fold—never splitting before—so that the artificial minority examples were obtained only on the training part of that fold. This has been implemented to eradicate information leaks and inflated performance estimates [21].</w:t>
+        <w:t>The dataset was divided using a stratified 80/20 split, yielding 736 training cases and 184 test cases while maintaining the class distribution in both sets. To address class imbalance, SMOTE (k=5) was applied exclusively within each cross-validation training fold to prevent data leakage — synthetic samples were never generated from test fold data. Five classifiers were evaluated using well-established hyperparameters: Logistic Regression (max_iter=1000, solver=lbfgs), Random Forest (n_estimators=100, max_depth=None, min_samples_split=2), XGBoost (n_estimators=100, learning_rate=0.1, max_depth=6, eval_metric=logloss), SVM (C=1.0, kernel=rbf, gamma=scale, probability=True), and KNN (n_neighbors=5, metric=minkowski). Model performance was assessed using accuracy, precision, recall, F1 score, and AUC under stratified 5-fold cross-validation with a fixed random seed (42) to ensure reproducibility.</w:t>
       </w:r>
     </w:p>
     <w:p>
@@ -1680,12 +1665,7 @@
         </w:rPr>
       </w:pPr>
       <w:r>
-        <w:rPr>
-          <w:sz w:val="24"/>
-          <w:szCs w:val="24"/>
-          <w:rtl w:val="0"/>
-        </w:rPr>
-        <w:t xml:space="preserve">Intrinsic limitations remain. The Cleveland subset is small (n=304) and has been conducted at only one centre, restricting external generalisability. Binarisation of the target collapses the disease severity into a two-class problem, which can miss subtle risk stratification. Though beneficial, SMOTE also injects artificial points, which may even slightly change the estimates of feature importance. Adversarial testing is yet to be fully implemented; its complete application will further boost the confidence of real-world resilience. Lastly, SHAP and LIME display an association, not causal mechanisms, which must be adhered to when interpreting clinical results. These constraints are recapitulated in the discussion and give the impetus to the future work as indicated in the concluding section [26].</w:t>
+        <w:t>Several intrinsic limitations must be acknowledged. First, despite using all four UCI centre subsets (n=920), missingness is severe in key features: ca is missing in 66.4% of records and thal in 52.8%, meaning the imputed values for these features may not reflect true clinical measurements and could bias feature importance estimates. Second, the dataset originates from four centres but remains limited in geographic and demographic diversity, restricting external generalisability. Third, the binary target collapses the original five-point disease severity scale, preventing the model from distinguishing mild from severe cases. Fourth, SMOTE generates synthetic samples which may introduce artefacts that affect SHAP feature importance values. Fifth, the adversarial robustness testing described in this study was designed conceptually only and was not fully implemented as an automated pipeline. Finally, SHAP and LIME explain associations between features and predictions; they do not establish causal relationships, and unmeasured confounders cannot be excluded.</w:t>
       </w:r>
     </w:p>
     <w:p>
@@ -1756,12 +1736,7 @@
         </w:rPr>
       </w:pPr>
       <w:r>
-        <w:rPr>
-          <w:sz w:val="24"/>
-          <w:szCs w:val="24"/>
-          <w:rtl w:val="0"/>
-        </w:rPr>
-        <w:t xml:space="preserve">After filling in missing markers (’?’ and blank cells) and imputing categorical features with the mode and numerical features with the median, all columns reported a 0 null value, as indicated in the post-imputation summary (all dtypes showing 0). The age, trestbps, chol, thalch, and oldpeak had outlier capping with the 1.5 × IQR  rule applied before and after box plotting to ensure the effective removal of extreme values of the scale without distorting the underlying distributions. This ensures that the following models were trained on completely clean data to eliminate a possible source of bias.</w:t>
+        <w:t>Following median imputation for continuous features and mode imputation for categorical features, all columns reported zero missing values. The physically impossible negative values in oldpeak (minimum -2.6 in the raw data) were corrected by clipping to zero before IQR capping, as ST depression is by clinical definition a non-negative measurement. Outlier capping with the 1.5×IQR rule was applied to age, trestbps, chol, thalch, and oldpeak; the feature ca was excluded as it is a discrete count variable. Before and after box plots confirmed that extreme values were successfully removed without distorting the central tendency or shape of any distribution. The final clean dataset of 920 records with 13 features was then passed to the modelling pipeline.</w:t>
       </w:r>
     </w:p>
     <w:p>

</xml_diff>

<commit_message>
docs: update CV results, ROC discussion, summary table with real model performance numbers
</commit_message>
<xml_diff>
--- a/COM748 Final report Marjan Done.docx
+++ b/COM748 Final report Marjan Done.docx
@@ -1897,30 +1897,20 @@
         </w:rPr>
       </w:pPr>
       <w:r>
-        <w:rPr>
-          <w:sz w:val="24"/>
-          <w:szCs w:val="24"/>
-          <w:rtl w:val="0"/>
-        </w:rPr>
-        <w:t xml:space="preserve">When a bar graph compares the five models in terms of accuracy, precision, recall, F1 score and AUC, there is a tightly clustered set of high performers. It is outlined in Table 1 below. Models were all above 0.83 accuracy, with the power of the chosen features being discriminative. It is important to note that even a linear baseline could be able to articulate the underlying patterns once the data are appropriately scaled and balanced. Random Forest and KNN with the accuracies of 0.902 and AUCs of 0.946 and 0.951, respectively. With slightly less strength (precision was 0.765), though still strong (precision 0.836, AUC 0.935), XGBoost had to make a slight tradeoff: its precision was the lowest (0.765), but its recall was the best (0.929)—the clinically preferable direction [27].</w:t>
-      </w:r>
-    </w:p>
-    <w:p>
-      <w:pPr>
-        <w:spacing w:line="360" w:lineRule="auto"/>
-        <w:jc w:val="both"/>
-        <w:rPr>
-          <w:sz w:val="24"/>
-          <w:szCs w:val="24"/>
-        </w:rPr>
-      </w:pPr>
-      <w:r>
-        <w:rPr>
-          <w:sz w:val="24"/>
-          <w:szCs w:val="24"/>
-          <w:rtl w:val="0"/>
-        </w:rPr>
-        <w:t xml:space="preserve">The ROC curves are a threshold-independent measure of the discrimination. All five classifiers are much above the diagonal random guess line, with a minimum AUC = 0.935 (XGBoost). The Logistic Regression curve and SVM curve nearly intersect, whereas the curves of the Random Forest and KNN are slightly off in the smaller area of false positives. This uniform AUC band of 0.935-0.960 means that the engineered feature sequence and SMOTE augmented training yielded models that distinguish cases in positive and negative with high reliability. The AUC variance between fivefold cross validation was below 0.03 per model, which validates that the models are stable and that the criteria of robustness that were followed in the methodology were met.</w:t>
+        <w:t>Five-fold stratified cross-validation was conducted on the training set (n=736) with SMOTE applied inside each fold. SVM achieved the highest AUC of 0.889 ± 0.024, followed closely by Logistic Regression (0.882 ± 0.022), Random Forest (0.877 ± 0.025), KNN (0.862 ± 0.043), and XGBoost (0.858 ± 0.024). All five models achieved accuracy above 0.78 and F1 scores above 0.80, indicating consistently strong performance across folds. The AUC standard deviation remained below 0.03 for four of the five models, confirming stable and reproducible performance. KNN showed slightly higher variance (AUC SD=0.043), suggesting greater sensitivity to fold composition. The full cross-validation results are summarised in Table I.</w:t>
+      </w:r>
+    </w:p>
+    <w:p>
+      <w:pPr>
+        <w:spacing w:line="360" w:lineRule="auto"/>
+        <w:jc w:val="both"/>
+        <w:rPr>
+          <w:sz w:val="24"/>
+          <w:szCs w:val="24"/>
+        </w:rPr>
+      </w:pPr>
+      <w:r>
+        <w:t>The ROC curves provide a threshold-independent measure of discrimination. All five classifiers performed well above the diagonal random-guess baseline. The AUC band of 0.858–0.889 across all models indicates that the engineered feature pipeline and SMOTE-augmented training produced reliable discriminators between disease-positive and disease-negative cases. SVM and Logistic Regression produced the tightest and highest-performing curves, while XGBoost and KNN sat slightly lower in the low false-positive region.</w:t>
       </w:r>
     </w:p>
     <w:p>
@@ -3058,28 +3048,8 @@
             <w:vAlign w:val="top"/>
           </w:tcPr>
           <w:p>
-            <w:pPr>
-              <w:spacing w:line="360" w:lineRule="auto"/>
-              <w:jc w:val="both"/>
-              <w:rPr>
-                <w:sz w:val="24"/>
-                <w:szCs w:val="24"/>
-              </w:rPr>
-            </w:pPr>
             <w:r>
-              <w:rPr>
-                <w:b w:val="1"/>
-                <w:bCs w:val="1"/>
-                <w:sz w:val="24"/>
-                <w:szCs w:val="24"/>
-                <w:rtl w:val="0"/>
-              </w:rPr>
-              <w:t xml:space="preserve">#</w:t>
-            </w:r>
-            <w:r>
-              <w:rPr>
-                <w:rtl w:val="0"/>
-              </w:rPr>
+              <w:t>#</w:t>
             </w:r>
           </w:p>
         </w:tc>
@@ -3088,28 +3058,8 @@
             <w:vAlign w:val="top"/>
           </w:tcPr>
           <w:p>
-            <w:pPr>
-              <w:spacing w:line="360" w:lineRule="auto"/>
-              <w:jc w:val="both"/>
-              <w:rPr>
-                <w:sz w:val="24"/>
-                <w:szCs w:val="24"/>
-              </w:rPr>
-            </w:pPr>
             <w:r>
-              <w:rPr>
-                <w:b w:val="1"/>
-                <w:bCs w:val="1"/>
-                <w:sz w:val="24"/>
-                <w:szCs w:val="24"/>
-                <w:rtl w:val="0"/>
-              </w:rPr>
-              <w:t xml:space="preserve">Finding</w:t>
-            </w:r>
-            <w:r>
-              <w:rPr>
-                <w:rtl w:val="0"/>
-              </w:rPr>
+              <w:t>Finding</w:t>
             </w:r>
           </w:p>
         </w:tc>
@@ -3118,28 +3068,8 @@
             <w:vAlign w:val="top"/>
           </w:tcPr>
           <w:p>
-            <w:pPr>
-              <w:spacing w:line="360" w:lineRule="auto"/>
-              <w:jc w:val="both"/>
-              <w:rPr>
-                <w:sz w:val="24"/>
-                <w:szCs w:val="24"/>
-              </w:rPr>
-            </w:pPr>
             <w:r>
-              <w:rPr>
-                <w:b w:val="1"/>
-                <w:bCs w:val="1"/>
-                <w:sz w:val="24"/>
-                <w:szCs w:val="24"/>
-                <w:rtl w:val="0"/>
-              </w:rPr>
-              <w:t xml:space="preserve">Evidence</w:t>
-            </w:r>
-            <w:r>
-              <w:rPr>
-                <w:rtl w:val="0"/>
-              </w:rPr>
+              <w:t>Evidence</w:t>
             </w:r>
           </w:p>
         </w:tc>
@@ -3154,21 +3084,8 @@
             <w:vAlign w:val="top"/>
           </w:tcPr>
           <w:p>
-            <w:pPr>
-              <w:spacing w:line="360" w:lineRule="auto"/>
-              <w:jc w:val="both"/>
-              <w:rPr>
-                <w:sz w:val="24"/>
-                <w:szCs w:val="24"/>
-              </w:rPr>
-            </w:pPr>
             <w:r>
-              <w:rPr>
-                <w:sz w:val="24"/>
-                <w:szCs w:val="24"/>
-                <w:rtl w:val="0"/>
-              </w:rPr>
-              <w:t xml:space="preserve">1</w:t>
+              <w:t>1</w:t>
             </w:r>
           </w:p>
         </w:tc>
@@ -3177,21 +3094,8 @@
             <w:vAlign w:val="top"/>
           </w:tcPr>
           <w:p>
-            <w:pPr>
-              <w:spacing w:line="360" w:lineRule="auto"/>
-              <w:jc w:val="both"/>
-              <w:rPr>
-                <w:sz w:val="24"/>
-                <w:szCs w:val="24"/>
-              </w:rPr>
-            </w:pPr>
             <w:r>
-              <w:rPr>
-                <w:sz w:val="24"/>
-                <w:szCs w:val="24"/>
-                <w:rtl w:val="0"/>
-              </w:rPr>
-              <w:t xml:space="preserve">Data integrity achieved</w:t>
+              <w:t>Data integrity achieved</w:t>
             </w:r>
           </w:p>
         </w:tc>
@@ -3200,21 +3104,8 @@
             <w:vAlign w:val="top"/>
           </w:tcPr>
           <w:p>
-            <w:pPr>
-              <w:spacing w:line="360" w:lineRule="auto"/>
-              <w:jc w:val="both"/>
-              <w:rPr>
-                <w:sz w:val="24"/>
-                <w:szCs w:val="24"/>
-              </w:rPr>
-            </w:pPr>
             <w:r>
-              <w:rPr>
-                <w:sz w:val="24"/>
-                <w:szCs w:val="24"/>
-                <w:rtl w:val="0"/>
-              </w:rPr>
-              <w:t xml:space="preserve">None of the missing values persist after imputation; outliers are limited without distorting distributions (before/after box plots).</w:t>
+              <w:t>Zero missing values after imputation; outliers capped via IQR 1.5x; oldpeak negative values corrected to 0.</w:t>
             </w:r>
           </w:p>
         </w:tc>
@@ -3229,21 +3120,8 @@
             <w:vAlign w:val="top"/>
           </w:tcPr>
           <w:p>
-            <w:pPr>
-              <w:spacing w:line="360" w:lineRule="auto"/>
-              <w:jc w:val="both"/>
-              <w:rPr>
-                <w:sz w:val="24"/>
-                <w:szCs w:val="24"/>
-              </w:rPr>
-            </w:pPr>
             <w:r>
-              <w:rPr>
-                <w:sz w:val="24"/>
-                <w:szCs w:val="24"/>
-                <w:rtl w:val="0"/>
-              </w:rPr>
-              <w:t xml:space="preserve">2</w:t>
+              <w:t>2</w:t>
             </w:r>
           </w:p>
         </w:tc>
@@ -3252,21 +3130,8 @@
             <w:vAlign w:val="top"/>
           </w:tcPr>
           <w:p>
-            <w:pPr>
-              <w:spacing w:line="360" w:lineRule="auto"/>
-              <w:jc w:val="both"/>
-              <w:rPr>
-                <w:sz w:val="24"/>
-                <w:szCs w:val="24"/>
-              </w:rPr>
-            </w:pPr>
             <w:r>
-              <w:rPr>
-                <w:sz w:val="24"/>
-                <w:szCs w:val="24"/>
-                <w:rtl w:val="0"/>
-              </w:rPr>
-              <w:t xml:space="preserve">Strong classifier performance</w:t>
+              <w:t>Strong classifier performance</w:t>
             </w:r>
           </w:p>
         </w:tc>
@@ -3275,21 +3140,8 @@
             <w:vAlign w:val="top"/>
           </w:tcPr>
           <w:p>
-            <w:pPr>
-              <w:spacing w:line="360" w:lineRule="auto"/>
-              <w:jc w:val="both"/>
-              <w:rPr>
-                <w:sz w:val="24"/>
-                <w:szCs w:val="24"/>
-              </w:rPr>
-            </w:pPr>
             <w:r>
-              <w:rPr>
-                <w:sz w:val="24"/>
-                <w:szCs w:val="24"/>
-                <w:rtl w:val="0"/>
-              </w:rPr>
-              <w:t xml:space="preserve">Logistic Regression &amp; SVM AUC = 0.960; Random Forest precision = 0.87, recall = 0.93.</w:t>
+              <w:t>SVM AUC = 0.889 ± 0.024 (highest); Logistic Regression AUC = 0.882 ± 0.022; all models AUC &gt; 0.858.</w:t>
             </w:r>
           </w:p>
         </w:tc>
@@ -3304,21 +3156,8 @@
             <w:vAlign w:val="top"/>
           </w:tcPr>
           <w:p>
-            <w:pPr>
-              <w:spacing w:line="360" w:lineRule="auto"/>
-              <w:jc w:val="both"/>
-              <w:rPr>
-                <w:sz w:val="24"/>
-                <w:szCs w:val="24"/>
-              </w:rPr>
-            </w:pPr>
             <w:r>
-              <w:rPr>
-                <w:sz w:val="24"/>
-                <w:szCs w:val="24"/>
-                <w:rtl w:val="0"/>
-              </w:rPr>
-              <w:t xml:space="preserve">3</w:t>
+              <w:t>3</w:t>
             </w:r>
           </w:p>
         </w:tc>
@@ -3327,21 +3166,8 @@
             <w:vAlign w:val="top"/>
           </w:tcPr>
           <w:p>
-            <w:pPr>
-              <w:spacing w:line="360" w:lineRule="auto"/>
-              <w:jc w:val="both"/>
-              <w:rPr>
-                <w:sz w:val="24"/>
-                <w:szCs w:val="24"/>
-              </w:rPr>
-            </w:pPr>
             <w:r>
-              <w:rPr>
-                <w:sz w:val="24"/>
-                <w:szCs w:val="24"/>
-                <w:rtl w:val="0"/>
-              </w:rPr>
-              <w:t xml:space="preserve">Stable cross-validation</w:t>
+              <w:t>Stable cross-validation</w:t>
             </w:r>
           </w:p>
         </w:tc>
@@ -3350,21 +3176,8 @@
             <w:vAlign w:val="top"/>
           </w:tcPr>
           <w:p>
-            <w:pPr>
-              <w:spacing w:line="360" w:lineRule="auto"/>
-              <w:jc w:val="both"/>
-              <w:rPr>
-                <w:sz w:val="24"/>
-                <w:szCs w:val="24"/>
-              </w:rPr>
-            </w:pPr>
             <w:r>
-              <w:rPr>
-                <w:sz w:val="24"/>
-                <w:szCs w:val="24"/>
-                <w:rtl w:val="0"/>
-              </w:rPr>
-              <w:t xml:space="preserve">AUC standard deviation &lt; 0.03 of all five models in 5 fold stratified CV. </w:t>
+              <w:t>AUC SD &lt; 0.026 for 4 of 5 models across 5-fold stratified CV; KNN SD = 0.043 (highest variance).</w:t>
             </w:r>
           </w:p>
         </w:tc>
@@ -3379,21 +3192,8 @@
             <w:vAlign w:val="top"/>
           </w:tcPr>
           <w:p>
-            <w:pPr>
-              <w:spacing w:line="360" w:lineRule="auto"/>
-              <w:jc w:val="both"/>
-              <w:rPr>
-                <w:sz w:val="24"/>
-                <w:szCs w:val="24"/>
-              </w:rPr>
-            </w:pPr>
             <w:r>
-              <w:rPr>
-                <w:sz w:val="24"/>
-                <w:szCs w:val="24"/>
-                <w:rtl w:val="0"/>
-              </w:rPr>
-              <w:t xml:space="preserve">4</w:t>
+              <w:t>4</w:t>
             </w:r>
           </w:p>
         </w:tc>
@@ -3402,21 +3202,8 @@
             <w:vAlign w:val="top"/>
           </w:tcPr>
           <w:p>
-            <w:pPr>
-              <w:spacing w:line="360" w:lineRule="auto"/>
-              <w:jc w:val="both"/>
-              <w:rPr>
-                <w:sz w:val="24"/>
-                <w:szCs w:val="24"/>
-              </w:rPr>
-            </w:pPr>
             <w:r>
-              <w:rPr>
-                <w:sz w:val="24"/>
-                <w:szCs w:val="24"/>
-                <w:rtl w:val="0"/>
-              </w:rPr>
-              <w:t xml:space="preserve">Global SHAP: clinically plausible predictors</w:t>
+              <w:t>Global SHAP: clinically plausible predictors</w:t>
             </w:r>
           </w:p>
         </w:tc>
@@ -3425,21 +3212,8 @@
             <w:vAlign w:val="top"/>
           </w:tcPr>
           <w:p>
-            <w:pPr>
-              <w:spacing w:line="360" w:lineRule="auto"/>
-              <w:jc w:val="both"/>
-              <w:rPr>
-                <w:sz w:val="24"/>
-                <w:szCs w:val="24"/>
-              </w:rPr>
-            </w:pPr>
             <w:r>
-              <w:rPr>
-                <w:sz w:val="24"/>
-                <w:szCs w:val="24"/>
-                <w:rtl w:val="0"/>
-              </w:rPr>
-              <w:t xml:space="preserve">Top ranked were chest pain type, thalassemia, major vessel count, ST depression and exercise angina.</w:t>
+              <w:t>Top predictors: asymptomatic chest pain, reversible thalassemia, major vessel count, ST depression, exercise angina.</w:t>
             </w:r>
           </w:p>
         </w:tc>
@@ -3454,21 +3228,8 @@
             <w:vAlign w:val="top"/>
           </w:tcPr>
           <w:p>
-            <w:pPr>
-              <w:spacing w:line="360" w:lineRule="auto"/>
-              <w:jc w:val="both"/>
-              <w:rPr>
-                <w:sz w:val="24"/>
-                <w:szCs w:val="24"/>
-              </w:rPr>
-            </w:pPr>
             <w:r>
-              <w:rPr>
-                <w:sz w:val="24"/>
-                <w:szCs w:val="24"/>
-                <w:rtl w:val="0"/>
-              </w:rPr>
-              <w:t xml:space="preserve">5</w:t>
+              <w:t>5</w:t>
             </w:r>
           </w:p>
         </w:tc>
@@ -3477,21 +3238,8 @@
             <w:vAlign w:val="top"/>
           </w:tcPr>
           <w:p>
-            <w:pPr>
-              <w:spacing w:line="360" w:lineRule="auto"/>
-              <w:jc w:val="both"/>
-              <w:rPr>
-                <w:sz w:val="24"/>
-                <w:szCs w:val="24"/>
-              </w:rPr>
-            </w:pPr>
             <w:r>
-              <w:rPr>
-                <w:sz w:val="24"/>
-                <w:szCs w:val="24"/>
-                <w:rtl w:val="0"/>
-              </w:rPr>
-              <w:t xml:space="preserve">Local convergence of SHAP &amp; LIME</w:t>
+              <w:t>Local convergence of SHAP &amp; LIME</w:t>
             </w:r>
           </w:p>
         </w:tc>
@@ -3500,21 +3248,8 @@
             <w:vAlign w:val="top"/>
           </w:tcPr>
           <w:p>
-            <w:pPr>
-              <w:spacing w:line="360" w:lineRule="auto"/>
-              <w:jc w:val="both"/>
-              <w:rPr>
-                <w:sz w:val="24"/>
-                <w:szCs w:val="24"/>
-              </w:rPr>
-            </w:pPr>
             <w:r>
-              <w:rPr>
-                <w:sz w:val="24"/>
-                <w:szCs w:val="24"/>
-                <w:rtl w:val="0"/>
-              </w:rPr>
-              <w:t xml:space="preserve">In case of one of the positive cases, both techniques recognized thalassemia and chest pain as the most powerful drivers. </w:t>
+              <w:t>For a true-positive patient, both SHAP waterfall and LIME independently identified thalassemia and chest pain as the strongest drivers.</w:t>
             </w:r>
           </w:p>
         </w:tc>
@@ -3530,13 +3265,7 @@
         </w:rPr>
       </w:pPr>
       <w:r>
-        <w:rPr>
-          <w:sz w:val="24"/>
-          <w:szCs w:val="24"/>
-          <w:rtl w:val="0"/>
-        </w:rPr>
-        <w:br w:type="textWrapping"/>
-        <w:t xml:space="preserve">The pipeline generated a clean complete dataset that allows all the five classifiers to achieve an AUC value between 0.935 and 0.960 with cross validation giving stability. Random Forest provided an optimal clinical performance (0.87 precision, 0.93 recall). Chest pain type, thalassemia, number of vessels, and ST segment characteristics were identified as the most significant predictors of Global SHAP analysis - also agreeing with other existing body of literature. Local explanations using SHAP and LIME all reduce to the same high impact features on an individual patient, and provide patient specific transparency. These results fulfill the main goal of the project: a readable, trustworthy ML system to predict early heart disease that provides a population level understanding, as well as an individual justification [29].</w:t>
+        <w:t>The pipeline produced a clean dataset enabling all five classifiers to achieve AUC values between 0.858 and 0.889 in 5-fold stratified cross-validation, with AUC standard deviations below 0.026 for four of the five models. SVM achieved the highest AUC (0.889), while Random Forest offered the best balance of precision (0.825 ± 0.045) and recall (0.835 ± 0.024). SHAP analysis identified asymptomatic chest pain, thalassemia type, and number of major vessels as the strongest predictors, consistent with established clinical knowledge.</w:t>
       </w:r>
     </w:p>
     <w:p>
@@ -3617,12 +3346,7 @@
         </w:rPr>
       </w:pPr>
       <w:r>
-        <w:rPr>
-          <w:sz w:val="24"/>
-          <w:szCs w:val="24"/>
-          <w:rtl w:val="0"/>
-        </w:rPr>
-        <w:t xml:space="preserve">The five average classifiers performed high discriminative behaviour with the highest AUC value of 0.935 (XGBoost) and the lowest AUC value of 0.960 (Logistic Regression and SVM). That the spread of these metrics is only slightly less than 0.025 suggests that the engineered feature set and training procedure to balance (with less than 0.025 difference) was robust enough to make model choice secondary. Both Logistic Regression and SVM have the highest AUC, which may be considered counterintuitive to the fact that many clinical relations are nonlinear. This finding, however, highlights the usefulness of z-score normalisation, outlier capping and one-hot encoding to generate linearly separable feature representations. It even justifies the choice that emphasises a thorough preprocessing pipeline instead of arbitrary model complexity [30].</w:t>
+        <w:t>All five classifiers achieved high discriminative performance in cross-validation. SVM recorded the highest AUC (0.889 ± 0.024), followed by Logistic Regression (0.882 ± 0.022), Random Forest (0.877 ± 0.025), KNN (0.862 ± 0.043), and XGBoost (0.858 ± 0.024). The narrow AUC spread of 0.031 across all five models suggests the feature engineering and preprocessing pipeline contributed more to performance than model complexity. SVM achieving the highest AUC with a linear-kernel-equivalent RBF configuration supports the view that the feature set is well-structured and linearly separable after standardisation.</w:t>
       </w:r>
     </w:p>
     <w:p>
@@ -3653,12 +3377,7 @@
         </w:rPr>
       </w:pPr>
       <w:r>
-        <w:rPr>
-          <w:sz w:val="24"/>
-          <w:szCs w:val="24"/>
-          <w:rtl w:val="0"/>
-        </w:rPr>
-        <w:t xml:space="preserve">An important observation is that the models are stable when they are subjected to cross-validation with the view of the model less than five times. The performance was not elevated due to some sort of happen-chance train test split. This regularity is a direct consequence of the stratified divide, fixed random seed, and SMOTE integration of each fold, ensuring that the pipeline generalizes in a reliable manner with respect to unseen data [32].</w:t>
+        <w:t>Cross-validation stability was strong across four models, with AUC standard deviations below 0.026. KNN was the exception with SD=0.043, indicating higher sensitivity to the specific composition of each fold — likely a consequence of its instance-based learning being more affected by the SMOTE synthetic samples in training folds. The consistent performance across folds validates the robustness of the CRISP-DM pipeline.</w:t>
       </w:r>
     </w:p>
     <w:p>

</xml_diff>

<commit_message>
docs: update test set results, RF analysis, discussion with real performance numbers
</commit_message>
<xml_diff>
--- a/COM748 Final report Marjan Done.docx
+++ b/COM748 Final report Marjan Done.docx
@@ -1897,20 +1897,20 @@
         </w:rPr>
       </w:pPr>
       <w:r>
-        <w:t>Five-fold stratified cross-validation was conducted on the training set (n=736) with SMOTE applied inside each fold. SVM achieved the highest AUC of 0.889 ± 0.024, followed closely by Logistic Regression (0.882 ± 0.022), Random Forest (0.877 ± 0.025), KNN (0.862 ± 0.043), and XGBoost (0.858 ± 0.024). All five models achieved accuracy above 0.78 and F1 scores above 0.80, indicating consistently strong performance across folds. The AUC standard deviation remained below 0.03 for four of the five models, confirming stable and reproducible performance. KNN showed slightly higher variance (AUC SD=0.043), suggesting greater sensitivity to fold composition. The full cross-validation results are summarised in Table I.</w:t>
-      </w:r>
-    </w:p>
-    <w:p>
-      <w:pPr>
-        <w:spacing w:line="360" w:lineRule="auto"/>
-        <w:jc w:val="both"/>
-        <w:rPr>
-          <w:sz w:val="24"/>
-          <w:szCs w:val="24"/>
-        </w:rPr>
-      </w:pPr>
-      <w:r>
-        <w:t>The ROC curves provide a threshold-independent measure of discrimination. All five classifiers performed well above the diagonal random-guess baseline. The AUC band of 0.858–0.889 across all models indicates that the engineered feature pipeline and SMOTE-augmented training produced reliable discriminators between disease-positive and disease-negative cases. SVM and Logistic Regression produced the tightest and highest-performing curves, while XGBoost and KNN sat slightly lower in the low false-positive region.</w:t>
+        <w:t>Five-fold stratified cross-validation was conducted on the training set (n=736) with SMOTE applied inside each fold. SVM achieved the highest cross-validation AUC of 0.889 ± 0.024, followed by Logistic Regression (0.882 ± 0.022), Random Forest (0.877 ± 0.025), KNN (0.862 ± 0.043), and XGBoost (0.858 ± 0.024). On the held-out test set (n=184), Random Forest and XGBoost tied on accuracy (0.853) and F1 (0.871), with Random Forest achieving the highest AUC of 0.917. SVM recorded the highest recall of 0.902, meaning it missed the fewest disease-positive cases — a clinically desirable property. Logistic Regression achieved an AUC of 0.898 and KNN the lowest AUC of 0.878. The full test set results are presented in Table II.</w:t>
+      </w:r>
+    </w:p>
+    <w:p>
+      <w:pPr>
+        <w:spacing w:line="360" w:lineRule="auto"/>
+        <w:jc w:val="both"/>
+        <w:rPr>
+          <w:sz w:val="24"/>
+          <w:szCs w:val="24"/>
+        </w:rPr>
+      </w:pPr>
+      <w:r>
+        <w:t>The ROC curves provide a threshold-independent measure of discrimination. All five classifiers performed well above the diagonal random-guess baseline, with test set AUC values ranging from 0.878 (KNN) to 0.917 (Random Forest). Random Forest and SVM produced the highest-performing curves, while KNN sat slightly lower. The AUC band of 0.878–0.917 across all models confirms that the preprocessing pipeline and SMOTE-augmented training produced reliable and consistent discriminators.</w:t>
       </w:r>
     </w:p>
     <w:p>
@@ -2071,12 +2071,7 @@
         </w:rPr>
       </w:pPr>
       <w:r>
-        <w:rPr>
-          <w:sz w:val="24"/>
-          <w:szCs w:val="24"/>
-          <w:rtl w:val="0"/>
-        </w:rPr>
-        <w:t xml:space="preserve">Random Forest was chosen as the first model that can be used to explain the results since the model has native measures of feature importance and a performance/explainability trade-off. The confusion matrix of it indicates that out of 61 instances of tests, 29 instances were correctly identified as true negatives and 26 correctly identified as true positives with only 4 false positives and 2 false negatives. That translates to an accuracy of 0.93 of the disease categories- that is, 93 per cent of the actual disease cases will be in the sample. The disease class is properly calibrated with a F1 score of 0.90 which shows that the average accuracy of the disease-class is good. The classification report also shows that even greater specificity as the No Disease class had a much higher specificity of 0.94 with a much smaller recall of 0.88. These measures are especially important in a clinical triage situation: good recall minimises the risk of releasing a patient at risk, and a good precision guarantee that the resources spending on follow up will not be overwhelmed by the false alarms [28].</w:t>
+        <w:t>Random Forest was selected as the primary model for explainability analysis due to its highest test AUC (0.917) and the best precision-recall balance: precision 0.850, recall 0.892, F1 0.871, accuracy 0.853. Its native feature importance mechanism also integrates naturally with SHAP TreeExplainer, enabling efficient and exact Shapley value computation. The confusion matrix (Figure 9) shows the breakdown of true positives, true negatives, false positives, and false negatives on the 184-case test set.</w:t>
       </w:r>
     </w:p>
     <w:p>
@@ -3141,7 +3136,7 @@
           </w:tcPr>
           <w:p>
             <w:r>
-              <w:t>SVM AUC = 0.889 ± 0.024 (highest); Logistic Regression AUC = 0.882 ± 0.022; all models AUC &gt; 0.858.</w:t>
+              <w:t>Random Forest: test AUC=0.917, accuracy=0.853, precision=0.850, recall=0.892, F1=0.871. SVM: highest recall=0.902. All models test AUC &gt; 0.878.</w:t>
             </w:r>
           </w:p>
         </w:tc>
@@ -3346,25 +3341,20 @@
         </w:rPr>
       </w:pPr>
       <w:r>
-        <w:t>All five classifiers achieved high discriminative performance in cross-validation. SVM recorded the highest AUC (0.889 ± 0.024), followed by Logistic Regression (0.882 ± 0.022), Random Forest (0.877 ± 0.025), KNN (0.862 ± 0.043), and XGBoost (0.858 ± 0.024). The narrow AUC spread of 0.031 across all five models suggests the feature engineering and preprocessing pipeline contributed more to performance than model complexity. SVM achieving the highest AUC with a linear-kernel-equivalent RBF configuration supports the view that the feature set is well-structured and linearly separable after standardisation.</w:t>
-      </w:r>
-    </w:p>
-    <w:p>
-      <w:pPr>
-        <w:spacing w:line="360" w:lineRule="auto"/>
-        <w:jc w:val="both"/>
-        <w:rPr>
-          <w:sz w:val="24"/>
-          <w:szCs w:val="24"/>
-        </w:rPr>
-      </w:pPr>
-      <w:r>
-        <w:rPr>
-          <w:sz w:val="24"/>
-          <w:szCs w:val="24"/>
-          <w:rtl w:val="0"/>
-        </w:rPr>
-        <w:t xml:space="preserve">Random Forest was chosen as the main model to be explained due to the balancing effect between the model precision (attained 0.87) and recall (reached 0.93). The most important in the context of a screening test is recall: a miss of a true disease case (false negative) has much more clinical risk than a false alarm. The model with a recall of 0.93 indicates that only 7% 85% disease cases had been missed, which is comparable to or even higher than many other existing risk scores. The precision penalty (0.87) is not high but can be tolerated since it does not mean that more than one in five patients flagged would be referred unnecessarily to further testing. This is a trade-off that is well visualized in the confusion matrix and classification report and is consistent with the ethical stance of the project, one of assisting, but not replacing, clinical judgement [31].</w:t>
+        <w:t>All five classifiers achieved strong performance on the held-out test set. Random Forest recorded the highest AUC (0.917) and tied with XGBoost on accuracy (0.853) and F1 (0.871). SVM achieved the highest recall (0.902), missing only 10% of true disease cases — the most clinically critical metric in a screening context. Logistic Regression performed competitively with AUC 0.898 despite its simplicity, reinforcing that the feature engineering pipeline contributed substantially to overall performance. KNN was the weakest performer with AUC 0.878 and accuracy 0.821, consistent with its higher cross-validation variance (SD=0.043).</w:t>
+      </w:r>
+    </w:p>
+    <w:p>
+      <w:pPr>
+        <w:spacing w:line="360" w:lineRule="auto"/>
+        <w:jc w:val="both"/>
+        <w:rPr>
+          <w:sz w:val="24"/>
+          <w:szCs w:val="24"/>
+        </w:rPr>
+      </w:pPr>
+      <w:r>
+        <w:t>Random Forest was chosen as the primary model for SHAP and LIME explanation due to its highest test AUC (0.917) and strong recall (0.892), meaning it correctly identified 89.2% of all disease-positive cases in the test set. Its precision of 0.850 indicates that 85% of its positive predictions were correct, giving a reliable and balanced clinical decision-support profile.</w:t>
       </w:r>
     </w:p>
     <w:p>
@@ -3415,12 +3405,7 @@
         </w:rPr>
       </w:pPr>
       <w:r>
-        <w:rPr>
-          <w:sz w:val="24"/>
-          <w:szCs w:val="24"/>
-          <w:rtl w:val="0"/>
-        </w:rPr>
-        <w:t xml:space="preserve">The values of AUC found here (0.935-0.960) are favourable compared to recent studies. The RF accuracy of Saeed [2] was 90.2 Percent (but this is accuracy only, and it can be misleading in an imbalanced environment). In Waqar et al. [3], RF and XGBoost have an AUC of more than 0.90, but no precision-recall values and do not mention cross-validation variance. The present work builds upon the same findings and indicates that with proper preprocessing and SMOTE, linear models (SVM, Logistic Regression) can be pushed to their performance limits (comparable or even superior in their performance) and remain interpretable.</w:t>
+        <w:t>The test set AUC values obtained here (0.878–0.917) compare favourably with recent literature. Waqar et al. (2025) reported RF and XGBoost AUC values above 0.90 on the UCI dataset, consistent with our Random Forest AUC of 0.917. Lamir et al. (2025) reported similar accuracy ranges using ensemble methods. The present study adds to these results by combining SMOTE within cross-validation folds to prevent data leakage — a methodological control not consistently applied in prior work — and by providing both global (SHAP) and local (LIME) explanations for individual predictions.</w:t>
       </w:r>
     </w:p>
     <w:p>

</xml_diff>

<commit_message>
docs: update confusion matrix analysis with real TP/FP/TN/FN numbers for all 5 models
</commit_message>
<xml_diff>
--- a/COM748 Final report Marjan Done.docx
+++ b/COM748 Final report Marjan Done.docx
@@ -1897,7 +1897,7 @@
         </w:rPr>
       </w:pPr>
       <w:r>
-        <w:t>Five-fold stratified cross-validation was conducted on the training set (n=736) with SMOTE applied inside each fold. SVM achieved the highest cross-validation AUC of 0.889 ± 0.024, followed by Logistic Regression (0.882 ± 0.022), Random Forest (0.877 ± 0.025), KNN (0.862 ± 0.043), and XGBoost (0.858 ± 0.024). On the held-out test set (n=184), Random Forest and XGBoost tied on accuracy (0.853) and F1 (0.871), with Random Forest achieving the highest AUC of 0.917. SVM recorded the highest recall of 0.902, meaning it missed the fewest disease-positive cases — a clinically desirable property. Logistic Regression achieved an AUC of 0.898 and KNN the lowest AUC of 0.878. The full test set results are presented in Table II.</w:t>
+        <w:t>Five-fold stratified cross-validation on the training set (n=736) with SMOTE inside each fold showed SVM achieving the highest CV AUC of 0.889 ± 0.024, followed by Logistic Regression (0.882 ± 0.022), Random Forest (0.877 ± 0.025), KNN (0.862 ± 0.043), and XGBoost (0.858 ± 0.024). On the held-out test set (n=184), Random Forest and XGBoost both achieved accuracy of 0.853 and F1 of 0.871, with Random Forest recording the highest AUC of 0.917. The confusion matrices reveal the following true positive / false negative counts per model: Logistic Regression (TP=88, FN=14), Random Forest (TP=91, FN=11), XGBoost (TP=91, FN=11), SVM (TP=92, FN=10), KNN (TP=84, FN=18). SVM missed the fewest disease cases (FN=10, recall=0.902), making it the most clinically conservative classifier. KNN had the highest false negative count (FN=18), meaning it missed the most disease-positive patients.</w:t>
       </w:r>
     </w:p>
     <w:p>
@@ -2071,7 +2071,7 @@
         </w:rPr>
       </w:pPr>
       <w:r>
-        <w:t>Random Forest was selected as the primary model for explainability analysis due to its highest test AUC (0.917) and the best precision-recall balance: precision 0.850, recall 0.892, F1 0.871, accuracy 0.853. Its native feature importance mechanism also integrates naturally with SHAP TreeExplainer, enabling efficient and exact Shapley value computation. The confusion matrix (Figure 9) shows the breakdown of true positives, true negatives, false positives, and false negatives on the 184-case test set.</w:t>
+        <w:t>Random Forest was selected as the primary model for explainability analysis due to its highest test AUC (0.917) and best precision-recall balance. The confusion matrix (Figure 9) shows that on the 184-case test set, Random Forest correctly classified 66 true negatives and 91 true positives, with 16 false positives and 11 false negatives. Missing only 11 disease-positive cases out of 102 gives a recall of 0.892 — meaning 89.2% of actual heart disease patients were correctly identified. The 16 false positives represent patients flagged as disease-positive who were healthy, an acceptable trade-off in a clinical screening context where missing a true case carries greater risk than an unnecessary follow-up.</w:t>
       </w:r>
     </w:p>
     <w:p>
@@ -3341,7 +3341,7 @@
         </w:rPr>
       </w:pPr>
       <w:r>
-        <w:t>All five classifiers achieved strong performance on the held-out test set. Random Forest recorded the highest AUC (0.917) and tied with XGBoost on accuracy (0.853) and F1 (0.871). SVM achieved the highest recall (0.902), missing only 10% of true disease cases — the most clinically critical metric in a screening context. Logistic Regression performed competitively with AUC 0.898 despite its simplicity, reinforcing that the feature engineering pipeline contributed substantially to overall performance. KNN was the weakest performer with AUC 0.878 and accuracy 0.821, consistent with its higher cross-validation variance (SD=0.043).</w:t>
+        <w:t>All five classifiers achieved strong performance on the held-out test set (n=184). Random Forest recorded the highest AUC (0.917) with 91 true positives and only 11 false negatives. SVM achieved the highest recall (0.902) with 92 true positives and only 10 false negatives — the best performance for minimising missed diagnoses. Logistic Regression was competitive (AUC=0.898, TP=88, FN=14) despite its simplicity, reinforcing that the preprocessing pipeline drove much of the performance. XGBoost matched Random Forest exactly on TP/FN (91/11) but with a lower AUC (0.906). KNN was the weakest performer with 18 false negatives and AUC 0.878, consistent with its higher cross-validation variance.</w:t>
       </w:r>
     </w:p>
     <w:p>

</xml_diff>

<commit_message>
docs: update LIME explanation and SHAP/LIME convergence sections with real feature values
</commit_message>
<xml_diff>
--- a/COM748 Final report Marjan Done.docx
+++ b/COM748 Final report Marjan Done.docx
@@ -2632,12 +2632,7 @@
         </w:rPr>
       </w:pPr>
       <w:r>
-        <w:rPr>
-          <w:sz w:val="24"/>
-          <w:szCs w:val="24"/>
-          <w:rtl w:val="0"/>
-        </w:rPr>
-        <w:t xml:space="preserve">Although it is important in the world due to the average behaviour, clinical trust is usually based on the interpretation of a particular prediction. Two complementary local explanation methods were used with one positive test.</w:t>
+        <w:t>Although global feature importance reveals average model behaviour, clinical trust depends on understanding individual predictions. Two complementary local explanation methods were applied to the same true-positive patient (Patient 1): SHAP waterfall and LIME. SHAP decomposes the prediction by attributing exact Shapley values to each feature based on cooperative game theory, while LIME fits a locally faithful linear approximation around the specific patient instance. Applying both independently to the same patient allows cross-validation of the explanation — if both methods agree on the key drivers, this provides stronger evidence that the model is responding to clinically meaningful signals rather than data artefacts.</w:t>
       </w:r>
     </w:p>
     <w:p>
@@ -2835,13 +2830,7 @@
         </w:rPr>
       </w:pPr>
       <w:r>
-        <w:rPr>
-          <w:rFonts w:ascii="Gungsuh" w:cs="Gungsuh" w:eastAsia="Gungsuh" w:hAnsi="Gungsuh"/>
-          <w:sz w:val="24"/>
-          <w:szCs w:val="24"/>
-          <w:rtl w:val="0"/>
-        </w:rPr>
-        <w:t xml:space="preserve">The corroboration of the SHAP findings using the alternative philosophy is provided by LIME Explanation corroboration of the SHAP findings. The best LIME feature (reversible defect) is the best feature and the defect adds +0.26 to the disease probability, and another best feature iscp=False  (asymptomatic), which adds +0.19. Negative influences include ca ≤ 0.00 (–0.15)  and *slope=2* (upsloping, –0.08). Thalassemia, chest pain type, and number of affected vessels in the region are the same core factors, which the local approximation built by LIME attributes to be the drivers. The fact that SHAP and LIME agree that this is the case, supports the credibility of the explanation: two independent approaches converge on the same clinical indications.</w:t>
+        <w:t>The LIME explanation for the same true-positive patient (Patient 1) corroborates the SHAP findings using an entirely independent local approximation method. The top positive contributors to the disease prediction were: asymptomatic chest pain (cp_asymptomatic, +0.13), elevated ST depression (oldpeak &gt; 0.64, +0.13), exercise-induced angina (exang_TRUE, +0.10), absence of atypical angina (cp_atypical angina ≤ 0.00, +0.09), and older age (age &gt; 0.68, +0.07). Negative contributors — features pushing the prediction toward no disease — were: low vessel count (ca ≤ -0.36, -0.05) and absence of reversable thalassemia defect (thal_reversable defect ≤ 0.00, -0.04). The convergence between SHAP and LIME on asymptomatic chest pain and exercise-induced angina as the strongest disease drivers, despite using fundamentally different explanation algorithms, strengthens confidence in the clinical validity of the model's decision-making.</w:t>
       </w:r>
     </w:p>
     <w:p>
@@ -3479,12 +3468,7 @@
         </w:rPr>
       </w:pPr>
       <w:r>
-        <w:rPr>
-          <w:sz w:val="24"/>
-          <w:szCs w:val="24"/>
-          <w:rtl w:val="0"/>
-        </w:rPr>
-        <w:t xml:space="preserve">The fact that the study has a two-sided local explanatory strategy is what makes it unique. Both the SHAP waterfall plot and the LIME explanation of a single positive patient emphasised thalassemia status and non-symptomatic chest pain as the key with almost equal importance, yet the algorithms used in the two studies were radically different. This convergence is, however, non-trivial: it shows that the decision taken by the model, in that particular individual, is not an artefact of a single explanatory approach, but a strong signal that a clinician can utilise. The decomposition of the 0.77 prediction using the watermark plot to give a transparent, auditable trail allows the watermark plot to address the critique of black box methods that have historically limited the adoption of ML technology in the medical field [35].</w:t>
+        <w:t>The local explanation analysis demonstrates strong convergence between SHAP and LIME for Patient 1. LIME identified asymptomatic chest pain (+0.13) and elevated ST depression (+0.13) as the two strongest disease predictors, with exercise-induced angina (+0.10) and older age (+0.07) also contributing positively. SHAP independently ranked asymptomatic chest pain and exercise-induced angina among the top drivers for the same patient. This agreement between two algorithmically distinct methods — one based on Shapley values, the other on local linear approximation — provides strong evidence that the model is capturing genuine clinical signals. Both findings are consistent with established cardiology literature, where asymptomatic chest pain, ST depression, and exercise-induced angina are well-recognised indicators of coronary artery disease.</w:t>
       </w:r>
     </w:p>
     <w:p>

</xml_diff>

<commit_message>
docs: update SHAP waterfall, ROC, global SHAP sections with real values; fix SHAP summary plot type
</commit_message>
<xml_diff>
--- a/COM748 Final report Marjan Done.docx
+++ b/COM748 Final report Marjan Done.docx
@@ -1910,7 +1910,7 @@
         </w:rPr>
       </w:pPr>
       <w:r>
-        <w:t>The ROC curves provide a threshold-independent measure of discrimination. All five classifiers performed well above the diagonal random-guess baseline, with test set AUC values ranging from 0.878 (KNN) to 0.917 (Random Forest). Random Forest and SVM produced the highest-performing curves, while KNN sat slightly lower. The AUC band of 0.878–0.917 across all models confirms that the preprocessing pipeline and SMOTE-augmented training produced reliable and consistent discriminators.</w:t>
+        <w:t>The ROC curves (Figure 8) provide a threshold-independent measure of discrimination. All five classifiers performed well above the diagonal random-guess baseline. Random Forest achieved the highest AUC of 0.92, followed by XGBoost (0.91), SVM (0.91), Logistic Regression (0.90), and KNN (0.88). The tight clustering of four models between AUC 0.90–0.92 confirms that the preprocessing pipeline and SMOTE-augmented training produced consistently reliable classifiers. KNN sat noticeably lower with a more gradual initial rise, consistent with its instance-based learning being more sensitive to the high-missingness features in the dataset.</w:t>
       </w:r>
     </w:p>
     <w:p>
@@ -2220,12 +2220,7 @@
         </w:rPr>
       </w:pPr>
       <w:r>
-        <w:rPr>
-          <w:sz w:val="24"/>
-          <w:szCs w:val="24"/>
-          <w:rtl w:val="0"/>
-        </w:rPr>
-        <w:t xml:space="preserve">The most influential predictor is identified to be chest pain type (asymptomatic): patients who are presented with asymptomatic chest pain (cp = -4) receive a strong positive SHAP impact, that is, the model has been taught that this category is an important predictor of a disease. This is in line with the prevailing medical understanding in that silent ischemia is an established risk marker. Other high impact features include thalassemia (reversable defect), number of major vessels coloured by fluoroscopy (ca), ST depression (oldpeak), and exercise induced angina (exang) all of which have a clear positive association with heart disease. On the other hand, normal thalassemia outcome, female gender and an up-sloping ST segment swayed forecasts on to the healthy group. The expected direction is confirmed by the colour gradients: e.g. high ca values (red) cluster on the positive SHAP side, whereas low ca values (blue) spread around zero. or negative.</w:t>
+        <w:t>The most influential predictor globally is oldpeak (ST depression): elevated ST depression values consistently receive large positive SHAP contributions, pushing predictions toward disease. Exercise-induced angina (exang_TRUE) and asymptomatic chest pain (cp_asymptomatic) are the next strongest global predictors, with SHAP values reaching up to +0.08 and +0.06 respectively for individual patients. Age contributes positively at higher values, while normal thalassemia (thal_normal) and female sex (sex_Female) are associated with lower disease probability. These rankings are clinically consistent: ST depression, exercise angina, and asymptomatic chest pain are well-established indicators of coronary artery disease in the cardiology literature.</w:t>
       </w:r>
     </w:p>
     <w:p>
@@ -2645,12 +2640,7 @@
         </w:rPr>
       </w:pPr>
       <w:r>
-        <w:rPr>
-          <w:sz w:val="24"/>
-          <w:szCs w:val="24"/>
-          <w:rtl w:val="0"/>
-        </w:rPr>
-        <w:t xml:space="preserve">SHAP Waterfall Plot above breaks down the prediction between the base value (predicted outcome of the model  at its base, the expected model result in this case, say 0.50), and the final value of 0.77 of this patient. The greatest positive contributions have been made by thal_reversable defect (+0.11), cp_asymptomatic (+0.10), and exang_True (+0.03). These are partially offset by negative contributions from oldpeak (–0.10) and ca (–0.05), which in this particular patient had values that lowered the risk. The other features had less, aggregate impacts. This decomposition offers a transparent, feature by feature audit trail: a clinician can immediately see that the high probability is inspired by the thalassemia status and the presentation of chest pain of a patient.</w:t>
+        <w:t>The SHAP Waterfall Plot (Figure 15) breaks down the prediction for Patient 1 (True Positive) from the base value E[f(x)] = 0.501 — the model's average prediction across all patients — to the final prediction f(x) = 0.88. The strongest positive contributor was ST depression (oldpeak = 2.839, SHAP = +0.11), indicating that the patient's elevated ST depression pushed the disease probability up by 0.11. Exercise-induced angina (exang_TRUE, SHAP = +0.08) and asymptomatic chest pain (cp_asymptomatic, SHAP = +0.06) were the next strongest drivers. Additional positive contributions came from the absence of exercise angina encoding (exang_FALSE, +0.05), older age (age = 0.792 normalised, +0.04), absence of normal thalassemia (thal_normal, +0.03), and absence of atypical angina (cp_atypical angina, +0.02). The only negative contributors were low vessel count (ca = -0.358 normalised, -0.01) and fixed thalassemia defect (thal_fixed defect, -0.01), which marginally pulled the prediction toward no disease. The remaining 16 features contributed a combined +0.02.</w:t>
       </w:r>
     </w:p>
     <w:p>
@@ -3450,12 +3440,7 @@
         </w:rPr>
       </w:pPr>
       <w:r>
-        <w:rPr>
-          <w:sz w:val="24"/>
-          <w:szCs w:val="24"/>
-          <w:rtl w:val="0"/>
-        </w:rPr>
-        <w:t xml:space="preserve">It was seen that the global SHAP analysis revealed particular factors to be the best predictors of heart disease: asymptomatic chest pain, reversible thalassemia defect, number of diseased vessels, ST depression, and exercise-induced angina. This ranking is not only consistent with clinical intuition, silent ischemia, abnormal thalassemia, and extensive involvement of the coronary artery are all diagnostic risk factors, but also replicates the results. The fact that these independent studies converged to learn about the same set of predictors gives much weight to the validity of the model [34].</w:t>
+        <w:t>The SHAP waterfall analysis for Patient 1 identified ST depression (oldpeak, +0.11), exercise-induced angina (exang_TRUE, +0.08), and asymptomatic chest pain (cp_asymptomatic, +0.06) as the three strongest drivers of the disease prediction, lifting the base probability from 0.501 to a final score of 0.88. LIME independently identified asymptomatic chest pain (+0.13) and ST depression (oldpeak &gt; 0.64, +0.13) as the top two contributors for the same patient. The agreement between these two algorithmically independent methods on the same top features provides strong evidence that the model is responding to genuine clinical signals rather than data artefacts. All three features — ST depression, exercise angina, and asymptomatic chest pain — are well-recognised indicators of coronary artery disease, confirming the clinical plausibility of the model's decision-making process.</w:t>
       </w:r>
     </w:p>
     <w:p>

</xml_diff>

<commit_message>
feat: add script to rewrite report sections with updated content and save as new file
</commit_message>
<xml_diff>
--- a/COM748 Final report Marjan Done.docx
+++ b/COM748 Final report Marjan Done.docx
@@ -102,7 +102,7 @@
           <w:szCs w:val="24"/>
           <w:rtl w:val="0"/>
         </w:rPr>
-        <w:t xml:space="preserve">Cardiovascular disease is the cause of death worldwide, but its early detection is still based on the cost and accessibility of it. Machine learning has predictive potential, and this model has a lack of visibility issues that decrease clinical trust. This is a research paper on an elaboratable ML system to predict heart diseases based on the UCI Cleveland dataset under the CRISP DM methodology. A total of 5 classifiers, Logistic Regression, Random Forest, XGBoost, SVM and KNN, were tested on accuracy, precision, recall, f1 score and AUC after median/mode imputation, IQR outlier capping, and SMOTE balancing within stratified 5-fold cross-validation. Logistic Regression and SVM had attained AUC 0.960; the random forest reached a precision of 0.87 and a recall of 0.93, with the variance of cross-validation being below 0.03. SHAP analysis revealed to the researchers that the key predictors were the presence of asymptomatic chest pain, thalassemia, and the number of vessels, which were consistent with clinical knowledge. SHAP waterfall and LIME explanations culminated on a case-by-case basis, assuring patient unique transparency. The framework is based on the use of ACM/BCS codes of ethics and represents a decision support system, which proves that interpretable ML can achieve high accuracy with clinical explainability.</w:t>
+        <w:t>Cardiovascular disease (CVD) remains the leading cause of death globally, yet early detection is hampered by cost and accessibility barriers. Machine learning offers predictive potential, but opaque models reduce clinical trust. This study presents an explainable ML framework for early heart disease prediction using the combined UCI heart disease dataset (n=920, four centres) under the CRISP-DM methodology. Five classifiers — Logistic Regression, Random Forest, XGBoost, SVM, and KNN — were evaluated across accuracy, precision, recall, F1, and AUC following median/mode imputation, IQR outlier capping, and SMOTE balancing applied strictly within stratified 5-fold cross-validation to prevent data leakage. Random Forest achieved the highest test AUC (0.916) with Precision=0.857 and Recall=0.882; SVM and XGBoost both achieved the highest recall (0.902), minimising missed diagnoses. Cross-validation AUC standard deviations remained below 0.041 across all models. SHAP analysis identified ST depression (oldpeak), asymptomatic chest pain, and exercise-induced angina as the strongest global predictors, consistent with established cardiology literature. SHAP waterfall and LIME explanations for individual patients converged on the same clinical drivers, providing independent cross-validation of model reasoning. The framework adheres to the ACM Code of Ethics and BCS Code of Conduct, and is positioned as a decision support tool rather than an autonomous diagnostic system, demonstrating that interpretable ML can achieve high predictive accuracy with clinical explainability.</w:t>
       </w:r>
     </w:p>
     <w:p>
@@ -1469,31 +1469,23 @@
           <w:szCs w:val="24"/>
         </w:rPr>
       </w:pPr>
-      <w:r>
-        <w:rPr>
-          <w:sz w:val="24"/>
-          <w:szCs w:val="24"/>
-          <w:rtl w:val="0"/>
-        </w:rPr>
-        <w:t xml:space="preserve">They evaluated 5 classifiers using default or widely accepted hyperparameters: Logistic Regression (max_iter = 1000), Random Forest (100trees), XGBoost(eval_metric='logloss'), SVM with radial basis function kernel and probability calibration and KNN (k = 5). Mean and standard deviation of accuracy, precision, recall, F1 score and area under the ROC curve (AUC) were calculated using stratified five-fold cross-validation. The models after cross-validation were refitted on the full training set and evaluated on the held-out test set. Visualisation of results was done in the form of grouped bar charts and overlapping ROC curves.</w:t>
-      </w:r>
-    </w:p>
-    <w:p>
-      <w:pPr>
-        <w:spacing w:line="360" w:lineRule="auto"/>
-        <w:jc w:val="both"/>
-        <w:rPr>
-          <w:sz w:val="24"/>
-          <w:szCs w:val="24"/>
-        </w:rPr>
-      </w:pPr>
-      <w:r>
-        <w:rPr>
-          <w:sz w:val="24"/>
-          <w:szCs w:val="24"/>
-          <w:rtl w:val="0"/>
-        </w:rPr>
-        <w:t xml:space="preserve">To further test against robustness, conceptual adversarial validation was designed: Gaussian noise at 5% and 10% of the standard deviation of features would be injected into test samples, and the degradation of the AUC and SHAP feature attribution stability would be measured. Although this test will eventually be completely automated as part of the broader integration, it has been included in the methodology as a sign that this is indeed a test that is to be unconditionally serious in terms of its rigorous validation [22].</w:t>
+    </w:p>
+    <w:p>
+      <w:pPr>
+        <w:spacing w:line="360" w:lineRule="auto"/>
+        <w:jc w:val="both"/>
+        <w:rPr>
+          <w:sz w:val="24"/>
+          <w:szCs w:val="24"/>
+        </w:rPr>
+      </w:pPr>
+      <w:r>
+        <w:rPr>
+          <w:sz w:val="24"/>
+          <w:szCs w:val="24"/>
+          <w:rtl w:val="0"/>
+        </w:rPr>
+        <w:t>To assess robustness, a conceptual adversarial validation protocol was designed: Gaussian noise at 5% and 10% of each feature's standard deviation would be injected into test samples, and the resulting degradation in AUC and SHAP attribution stability would be measured. This test was designed at the methodology level but was not implemented as a fully automated pipeline in this study; it is acknowledged as a planned extension for future work [22].</w:t>
       </w:r>
     </w:p>
     <w:p>
@@ -1897,20 +1889,22 @@
         </w:rPr>
       </w:pPr>
       <w:r>
-        <w:t>Five-fold stratified cross-validation on the training set (n=736) with SMOTE inside each fold showed SVM achieving the highest CV AUC of 0.889 ± 0.024, followed by Logistic Regression (0.882 ± 0.022), Random Forest (0.877 ± 0.025), KNN (0.862 ± 0.043), and XGBoost (0.858 ± 0.024). On the held-out test set (n=184), Random Forest and XGBoost both achieved accuracy of 0.853 and F1 of 0.871, with Random Forest recording the highest AUC of 0.917. The confusion matrices reveal the following true positive / false negative counts per model: Logistic Regression (TP=88, FN=14), Random Forest (TP=91, FN=11), XGBoost (TP=91, FN=11), SVM (TP=92, FN=10), KNN (TP=84, FN=18). SVM missed the fewest disease cases (FN=10, recall=0.902), making it the most clinically conservative classifier. KNN had the highest false negative count (FN=18), meaning it missed the most disease-positive patients.</w:t>
-      </w:r>
-    </w:p>
-    <w:p>
-      <w:pPr>
-        <w:spacing w:line="360" w:lineRule="auto"/>
-        <w:jc w:val="both"/>
-        <w:rPr>
-          <w:sz w:val="24"/>
-          <w:szCs w:val="24"/>
-        </w:rPr>
-      </w:pPr>
-      <w:r>
-        <w:t>The ROC curves (Figure 8) provide a threshold-independent measure of discrimination. All five classifiers performed well above the diagonal random-guess baseline. Random Forest achieved the highest AUC of 0.92, followed by XGBoost (0.91), SVM (0.91), Logistic Regression (0.90), and KNN (0.88). The tight clustering of four models between AUC 0.90–0.92 confirms that the preprocessing pipeline and SMOTE-augmented training produced consistently reliable classifiers. KNN sat noticeably lower with a more gradual initial rise, consistent with its instance-based learning being more sensitive to the high-missingness features in the dataset.</w:t>
+        <w:rPr/>
+        <w:t>Five-fold stratified cross-validation on the training set (n=736) with SMOTE applied inside each fold showed SVM achieving the highest CV AUC of 0.890 ± 0.023, followed by Logistic Regression (0.883 ± 0.023), Random Forest (0.876 ± 0.022), KNN (0.860 ± 0.041), and XGBoost (0.859 ± 0.026). On the held-out test set (n=184), Random Forest achieved the highest AUC of 0.916 and best precision-recall balance (Precision=0.857, Recall=0.882, F1=0.870). XGBoost and SVM both achieved the highest recall of 0.902, meaning they missed the fewest disease-positive cases (FN=10 each). The confusion matrix true positive / false negative counts per model were: Logistic Regression (TP=88, FN=14), Random Forest (TP=90, FN=12), XGBoost (TP=92, FN=10), SVM (TP=92, FN=10), KNN (TP=83, FN=19). KNN recorded the highest false negative count (FN=19), indicating the most missed diagnoses. Full metrics are reported in Table I (cross-validation) and Table II (test set).</w:t>
+      </w:r>
+    </w:p>
+    <w:p>
+      <w:pPr>
+        <w:spacing w:line="360" w:lineRule="auto"/>
+        <w:jc w:val="both"/>
+        <w:rPr>
+          <w:sz w:val="24"/>
+          <w:szCs w:val="24"/>
+        </w:rPr>
+      </w:pPr>
+      <w:r>
+        <w:rPr/>
+        <w:t>The ROC curves (Figure 8) provide a threshold-independent measure of discrimination. All five classifiers performed well above the diagonal random-guess baseline. Random Forest achieved the highest test AUC of 0.916, followed by SVM (0.913), XGBoost (0.903), Logistic Regression (0.900), and KNN (0.880). The tight clustering of four models between AUC 0.900–0.916 confirms that the preprocessing pipeline and SMOTE-augmented training produced consistently reliable classifiers. KNN sat noticeably lower, consistent with its instance-based learning being more sensitive to the high-missingness features in the dataset.</w:t>
       </w:r>
     </w:p>
     <w:p>
@@ -2071,7 +2065,8 @@
         </w:rPr>
       </w:pPr>
       <w:r>
-        <w:t>Random Forest was selected as the primary model for explainability analysis due to its highest test AUC (0.917) and best precision-recall balance. The confusion matrix (Figure 9) shows that on the 184-case test set, Random Forest correctly classified 66 true negatives and 91 true positives, with 16 false positives and 11 false negatives. Missing only 11 disease-positive cases out of 102 gives a recall of 0.892 — meaning 89.2% of actual heart disease patients were correctly identified. The 16 false positives represent patients flagged as disease-positive who were healthy, an acceptable trade-off in a clinical screening context where missing a true case carries greater risk than an unnecessary follow-up.</w:t>
+        <w:rPr/>
+        <w:t>Random Forest was selected as the primary model for explainability analysis due to its highest test AUC (0.916) and best overall precision-recall balance. The confusion matrix (Figure 9) shows that on the 184-case test set, Random Forest correctly classified 67 true negatives and 90 true positives, with 15 false positives and 12 false negatives. Missing only 12 disease-positive cases out of 102 gives a recall of 0.882, meaning 88.2% of actual heart disease patients were correctly identified. The 15 false positives represent patients flagged as disease-positive who were healthy — an acceptable trade-off in a clinical screening context where missing a true case carries greater risk than an unnecessary follow-up.</w:t>
       </w:r>
     </w:p>
     <w:p>
@@ -3282,7 +3277,7 @@
           <w:szCs w:val="24"/>
           <w:rtl w:val="0"/>
         </w:rPr>
-        <w:t xml:space="preserve">Experimental findings are significant indications that an explainable machine learning pipeline can be used to achieve high predictive accuracy, yet makes sense in clinical reasons. </w:t>
+        <w:t>The experimental results demonstrate that an explainable machine learning pipeline can achieve strong predictive performance while remaining interpretable in clinical terms.</w:t>
       </w:r>
     </w:p>
     <w:p>
@@ -3320,20 +3315,22 @@
         </w:rPr>
       </w:pPr>
       <w:r>
-        <w:t>All five classifiers achieved strong performance on the held-out test set (n=184). Random Forest recorded the highest AUC (0.917) with 91 true positives and only 11 false negatives. SVM achieved the highest recall (0.902) with 92 true positives and only 10 false negatives — the best performance for minimising missed diagnoses. Logistic Regression was competitive (AUC=0.898, TP=88, FN=14) despite its simplicity, reinforcing that the preprocessing pipeline drove much of the performance. XGBoost matched Random Forest exactly on TP/FN (91/11) but with a lower AUC (0.906). KNN was the weakest performer with 18 false negatives and AUC 0.878, consistent with its higher cross-validation variance.</w:t>
-      </w:r>
-    </w:p>
-    <w:p>
-      <w:pPr>
-        <w:spacing w:line="360" w:lineRule="auto"/>
-        <w:jc w:val="both"/>
-        <w:rPr>
-          <w:sz w:val="24"/>
-          <w:szCs w:val="24"/>
-        </w:rPr>
-      </w:pPr>
-      <w:r>
-        <w:t>Random Forest was chosen as the primary model for SHAP and LIME explanation due to its highest test AUC (0.917) and strong recall (0.892), meaning it correctly identified 89.2% of all disease-positive cases in the test set. Its precision of 0.850 indicates that 85% of its positive predictions were correct, giving a reliable and balanced clinical decision-support profile.</w:t>
+        <w:rPr/>
+        <w:t>All five classifiers achieved strong performance on the held-out test set (n=184). Random Forest recorded the highest AUC (0.916) with 90 true positives and 12 false negatives. SVM and XGBoost both achieved the highest recall (0.902) with only 10 false negatives each — making them the most clinically conservative classifiers for minimising missed diagnoses. Logistic Regression was competitive (AUC=0.900, TP=88, FN=14) despite its simplicity, reinforcing that the preprocessing pipeline and SMOTE drove much of the performance gain. XGBoost matched SVM on recall but recorded a lower AUC (0.903). KNN was the weakest performer with 19 false negatives and AUC 0.880, consistent with its higher cross-validation variance (SD=0.041) — likely a consequence of its instance-based learning being more sensitive to the SMOTE synthetic samples and high-missingness features.</w:t>
+      </w:r>
+    </w:p>
+    <w:p>
+      <w:pPr>
+        <w:spacing w:line="360" w:lineRule="auto"/>
+        <w:jc w:val="both"/>
+        <w:rPr>
+          <w:sz w:val="24"/>
+          <w:szCs w:val="24"/>
+        </w:rPr>
+      </w:pPr>
+      <w:r>
+        <w:rPr/>
+        <w:t>Random Forest was selected as the primary model for SHAP and LIME explanation due to its highest test AUC (0.916) and strong recall (0.882), meaning it correctly identified 88.2% of all disease-positive cases in the test set. Its precision of 0.857 indicates that 85.7% of its positive predictions were correct, giving a reliable and balanced clinical decision-support profile.</w:t>
       </w:r>
     </w:p>
     <w:p>
@@ -3384,7 +3381,8 @@
         </w:rPr>
       </w:pPr>
       <w:r>
-        <w:t>The test set AUC values obtained here (0.878–0.917) compare favourably with recent literature. Waqar et al. (2025) reported RF and XGBoost AUC values above 0.90 on the UCI dataset, consistent with our Random Forest AUC of 0.917. Lamir et al. (2025) reported similar accuracy ranges using ensemble methods. The present study adds to these results by combining SMOTE within cross-validation folds to prevent data leakage — a methodological control not consistently applied in prior work — and by providing both global (SHAP) and local (LIME) explanations for individual predictions.</w:t>
+        <w:rPr/>
+        <w:t>The test set AUC values obtained here (0.880–0.916) compare favourably with recent literature. Waqar et al. (2025) reported RF and XGBoost AUC values above 0.90 on the UCI dataset, consistent with our Random Forest AUC of 0.916 [8]. Lamir et al. (2025) reported similar accuracy ranges using ensemble methods [8]. The present study adds to these results by applying SMOTE strictly within cross-validation folds to prevent data leakage — a methodological control not consistently applied in prior work — and by providing both global (SHAP) and local (LIME) explanations for individual predictions [26].</w:t>
       </w:r>
     </w:p>
     <w:p>
@@ -3496,7 +3494,7 @@
           <w:szCs w:val="24"/>
           <w:rtl w:val="0"/>
         </w:rPr>
-        <w:t xml:space="preserve">There are several restrictions that have to be noted. To begin with, the Cleveland data is small (n=304), and they represent a single United States medical centre. This limits its generalisability to populations with varying demographics, lifestyle choices or healthcare services. Before any actual deployment into the real world, external validation on diverse ethnically and geographically spread cohorts of patients is necessary. Second, the binary target (abnormal vs. normal) collapses the original five-point disease severity scale, and it gets rid of potentially valuable information on disease progression. There may be more precise risk stratification by a multi-class classification, which is clinically desirable. Third, although SMOTE is useful for balanced training data, synthetic samples can also cause various artefacts, potentially affecting feature importance estimates. Fourth, adversarial testing is theoretical, where empirical data on the degradation of AUC under noise has not been collected. Lastly, SHAP and LIME are used to explain the factors in an associative, rather than causal manner; collider bias or the presence of unmeasured confounders cannot be discounted [36].</w:t>
+        <w:t>Several limitations must be acknowledged. First, although the dataset combines all four UCI centre subsets (n=920), missingness is severe in two key features: ca is missing in 66.4% of records and thal in 52.8%. The imputed values for these features may not reflect true clinical measurements and could bias feature importance estimates. Second, the dataset remains limited in geographic and demographic diversity, restricting external generalisability to other populations. Third, the binary target collapses the original five-point disease severity scale, removing clinically valuable information about disease progression. Fourth, SMOTE generates synthetic samples that may introduce artefacts affecting SHAP importance values. Fifth, the adversarial robustness testing was designed conceptually only and was not implemented as a fully automated pipeline. Finally, SHAP and LIME explain associations between features and predictions; they do not establish causal relationships, and unmeasured confounders cannot be excluded [36].</w:t>
       </w:r>
     </w:p>
     <w:p>
@@ -3582,25 +3580,25 @@
           <w:szCs w:val="24"/>
           <w:rtl w:val="0"/>
         </w:rPr>
-        <w:t xml:space="preserve">To sum it up, this study has embarked on the work of establishing an explainable machine learning framework to initial prediction of heart disease based on the CRISP DM approach and a sense of clinical transparency. The resultant pipeline was effective at preprocessing the UCI Cleveland dataset, being able to deal with missing values and outliers, classes can be balanced with SMOTE, and five classifiers can be benchmarked using an extensive set of metrics. Logistic Regression and SVM performed best in terms of AUC (0.960), whereas the Random Forest gave the best precision and recall ratio to balance (0.87 precision, 0.93 recall) with a high level of interpretability.</w:t>
-      </w:r>
-    </w:p>
-    <w:p>
-      <w:pPr>
-        <w:spacing w:line="360" w:lineRule="auto"/>
-        <w:jc w:val="both"/>
-        <w:rPr>
-          <w:sz w:val="24"/>
-          <w:szCs w:val="24"/>
-        </w:rPr>
-      </w:pPr>
-      <w:r>
-        <w:rPr>
-          <w:sz w:val="24"/>
-          <w:szCs w:val="24"/>
-          <w:rtl w:val="0"/>
-        </w:rPr>
-        <w:t xml:space="preserve">The combination of SHAP and LIME was especially beneficial. The significance of the predictors found was as follows: the most influential predictors were the presence of asymptomatic chest pain, reversible thalassemia, count of vessels and ST segment characteristics, all of which are both clinically plausible and correspond to the previous literature. Local cause of an individual patient proved that SHAP and LIME arrived at the same causes and supported the credibility of those choices made by the model. In five-fold cross-validation, AUC variance was found to be less than 0.03, which is considered to be the stability of the pipeline.</w:t>
+        <w:t>This study presented an explainable machine learning framework for early heart disease prediction, developed under the CRISP-DM methodology with a focus on clinical transparency and reproducibility. The pipeline processed the combined UCI heart disease dataset (n=920, four centres), handled missing values and outliers, balanced classes using SMOTE within cross-validation folds, and benchmarked five classifiers across five metrics. Random Forest achieved the highest test AUC (0.916) and the best overall precision-recall balance (Precision=0.857, Recall=0.882). SVM and XGBoost achieved the highest recall (0.902), minimising missed diagnoses. Cross-validation AUC standard deviations remained below 0.041 across all models, confirming pipeline stability.</w:t>
+      </w:r>
+    </w:p>
+    <w:p>
+      <w:pPr>
+        <w:spacing w:line="360" w:lineRule="auto"/>
+        <w:jc w:val="both"/>
+        <w:rPr>
+          <w:sz w:val="24"/>
+          <w:szCs w:val="24"/>
+        </w:rPr>
+      </w:pPr>
+      <w:r>
+        <w:rPr>
+          <w:sz w:val="24"/>
+          <w:szCs w:val="24"/>
+          <w:rtl w:val="0"/>
+        </w:rPr>
+        <w:t>The combination of SHAP and LIME provided complementary layers of interpretability. Globally, SHAP identified ST depression (oldpeak), asymptomatic chest pain, and exercise-induced angina as the three strongest disease predictors — findings consistent with established cardiology literature. At the individual level, SHAP waterfall and LIME explanations for the same true-positive patient converged on the same top drivers, providing independent cross-validation of the model's clinical reasoning. This agreement between two algorithmically distinct methods strengthens confidence that the model responds to genuine clinical signals rather than data artefacts.</w:t>
       </w:r>
     </w:p>
     <w:p>
@@ -3630,14 +3628,6 @@
           <w:szCs w:val="24"/>
         </w:rPr>
       </w:pPr>
-      <w:r>
-        <w:rPr>
-          <w:sz w:val="24"/>
-          <w:szCs w:val="24"/>
-          <w:rtl w:val="0"/>
-        </w:rPr>
-        <w:t xml:space="preserve">Though the single-centre data and binary target do not allow the generalisability, the project also offers a strong platform on which future work, e.g. multi-centre validation, multi-class severity prediction and its deployment as a real-time clinical tool can be based. Lastly, the research confirms that it is possible to get a combination of high predictive performance and an actual interpretation, bringing machine learning a step closer to the use that is safe, equitable and trusted by cardiovascular medicine. </w:t>
-      </w:r>
     </w:p>
     <w:p>
       <w:pPr>

</xml_diff>

<commit_message>
chore: update final report document with revisions
</commit_message>
<xml_diff>
--- a/COM748 Final report Marjan Done.docx
+++ b/COM748 Final report Marjan Done.docx
@@ -173,7 +173,7 @@
           <w:szCs w:val="24"/>
           <w:rtl w:val="0"/>
         </w:rPr>
-        <w:t xml:space="preserve">Cardiovascular disease (CVD) is the most dominant cause of death in the world, taking at least 17.9 million lives annually according to the World Health Organization. Early diagnosis is important because the right intervention on time can help a great deal to bring the morbidity and mortality to a lot lower level. Nevertheless, the traditional diagnostic pathways, i.e., angiography and stress testing, are frequently not accessible to the disadvantaged groups because they are expensive, and special clinician providers are scarce. A promising candidate is machine learning (ML), which can analyse intricate clinical data to determine individuals at risk before they fall ill [1]. However, most models with high performance are black boxes, which do not reveal how the model makes its decisions. This lack of transparency weakens the trust of medical practitioners and inhibits the use of it in clinical settings, where it is as important to understand the rationale behind a prediction as it is to simply make a prediction [2].</w:t>
+        <w:t>Cardiovascular disease (CVD) is the leading cause of death in the world, taking at least 17.9 million lives annually according to the World Health Organization. Early diagnosis is important because the right intervention on time can help a great deal to bring the morbidity and mortality to a lot lower level. Nevertheless, the traditional diagnostic pathways, i.e., angiography and stress testing, are frequently not accessible to the disadvantaged groups because they are expensive, and special clinician providers are scarce. A promising candidate is machine learning (ML), which can analyse intricate clinical data to determine individuals at risk before they fall ill [1]. However, most models with high performance are black boxes, which do not reveal how the model makes its decisions. This lack of transparency weakens the trust of medical practitioners and inhibits the use of it in clinical settings, where it is as important to understand the rationale behind a prediction as it is to simply make a prediction [2].</w:t>
       </w:r>
     </w:p>
     <w:p>
@@ -195,7 +195,7 @@
           <w:szCs w:val="24"/>
           <w:rtl w:val="0"/>
         </w:rPr>
-        <w:t xml:space="preserve">This study provides that gap by creating an elucidable ML model of the early identification of heart disease. The framework links powerful predictive modelling, as well as interpretability tools, to hold a position that clinicians can interrogate and interpret each diagnosis. The study is based on the popular UCI Cleveland heart disease dataset and follows the Cross-Industry Standard Process for Data Mining (CRISP DM) methodology to ensure the structure, reproducibility, and transparency of each step [3]. The objective of the work is to develop a machine learning algorithm capable of not just predicting heart disease with reasonable accuracy, but also giving clinically meaningful explanations of its predictions.</w:t>
+        <w:t>This study addresses that gap by developing an interpretable ML framework for early heart disease detection. The framework combines powerful predictive modelling with explainability tools, enabling clinicians to interrogate and understand each prediction. The study uses the combined UCI heart disease dataset and follows the CRISP-DM methodology to ensure structured, reproducible, and transparent analysis [3].</w:t>
       </w:r>
     </w:p>
     <w:p>
@@ -243,7 +243,7 @@
           <w:szCs w:val="24"/>
           <w:rtl w:val="0"/>
         </w:rPr>
-        <w:t xml:space="preserve">Preprocess the UCI data to handlk  e missing values, encode categorical values and to normalize numeric values while also correcting outliers by the interquartile range.</w:t>
+        <w:t>Preprocess the UCI data to handle missing values, encode categorical values and to normalize numeric values while also correcting outliers by the interquartile range.</w:t>
       </w:r>
     </w:p>
     <w:p>
@@ -363,14 +363,6 @@
           <w:szCs w:val="24"/>
         </w:rPr>
       </w:pPr>
-      <w:r>
-        <w:rPr>
-          <w:sz w:val="24"/>
-          <w:szCs w:val="24"/>
-          <w:rtl w:val="0"/>
-        </w:rPr>
-        <w:t xml:space="preserve">The paper begins by providing an abstract and introduction that clarify cardiovascular disease as a worldwide health issue, as well as the necessity of interpretable ML. The current work section discusses the previous predictive models and explainability gaps. Methodology will describe the preprocessing of data, balancing data with SMOTE, comparing classifiers, and SHAP / LIME. Results assess model performance, showing an AUC of 0.946 by Random Forest and the top predictors [4]. The discussion critically evaluates the findings and limitations; a conclusion summarizes contributions and suggests future work.</w:t>
-      </w:r>
     </w:p>
     <w:p>
       <w:pPr>
@@ -1543,7 +1535,7 @@
           <w:szCs w:val="24"/>
           <w:rtl w:val="0"/>
         </w:rPr>
-        <w:t xml:space="preserve">Interpretability was the concern dealt with by two global local approaches. Following the best performing model (Random Forest), SHAP values were generated with a bee swarm summary plot visualizing global feature importance on the positive class. To understand local knowledge, the prediction of a single positive instance was decomposed using a waterfall plot, indicating the effect each feature exerted on the derived output. Complementarily, LIME represented a second local explanation by perturbing the example and cost-effectively modelling a sparse linear representation. To enable LIME on categorical data, the original string features were label encoded into integers, and a custom prediction wrapper inversely transformed the perturbed samples back to strings before calling the model’s predict_proba. This hybrid XAI design would provide not only the population-wide picture but patient-specific justification, which can create trust in clinics to adopt the technology [23].</w:t>
+        <w:t>Interpretability was addressed using two complementary approaches. For global explanation, SHAP values were computed for the best-performing model (Random Forest), with a bee swarm summary plot visualising feature importance across the positive class. For local explanation, the prediction for a single true-positive patient was decomposed using a SHAP waterfall plot, showing each feature's contribution to the final prediction. LIME provided a second independent local explanation by fitting a sparse linear approximation around the same patient instance. To apply LIME to the one-hot encoded feature space, the preprocessed numpy array was passed directly to a custom predict_proba wrapper operating on the Random Forest classifier. This dual-method XAI design provides both population-level and patient-specific justification, supporting clinical trust in the model's decisions [23].</w:t>
       </w:r>
     </w:p>
     <w:p>
@@ -2324,7 +2316,7 @@
           <w:szCs w:val="24"/>
           <w:rtl w:val="0"/>
         </w:rPr>
-        <w:t xml:space="preserve">These rankings of global importance are congruent with the literature: AzimiLemiret al. also found that chest pain type, and ST slope were predominant parameters in their multiparametric cardiac study. These clinically intuitive predictors were independently rediscovered by the fact that our SMOTE balanced Random Forest, alone, rediscovered these same clinically common intuitive predictors.</w:t>
+        <w:t>These rankings of global importance are congruent with the literature: Azimi Lemir et al. also found that chest pain type, and ST slope were predominant parameters in their multiparametric cardiac study. These clinically intuitive predictors were independently rediscovered by the fact that our SMOTE balanced Random Forest, alone, rediscovered these same clinically common intuitive predictors.</w:t>
       </w:r>
     </w:p>
     <w:p>
@@ -3234,11 +3226,12 @@
         </w:rPr>
       </w:pPr>
       <w:r>
-        <w:t>The pipeline produced a clean dataset enabling all five classifiers to achieve AUC values between 0.858 and 0.889 in 5-fold stratified cross-validation, with AUC standard deviations below 0.026 for four of the five models. SVM achieved the highest AUC (0.889), while Random Forest offered the best balance of precision (0.825 ± 0.045) and recall (0.835 ± 0.024). SHAP analysis identified asymptomatic chest pain, thalassemia type, and number of major vessels as the strongest predictors, consistent with established clinical knowledge.</w:t>
-      </w:r>
-    </w:p>
-    <w:p>
-      <w:pPr>
+        <w:t>The pipeline produced a clean dataset enabling all five classifiers to achieve AUC values between 0.858 and 0.889 in 5-fold stratified cross-validation, with AUC standard deviations below 0.041 for four of the five models. SVM achieved the highest AUC (0.889), while Random Forest offered the best balance of precision (0.825 ± 0.045) and recall (0.835 ± 0.024). SHAP analysis identified asymptomatic chest pain, thalassemia type, and number of major vessels as the strongest predictors, consistent with established clinical knowledge.</w:t>
+      </w:r>
+    </w:p>
+    <w:p>
+      <w:pPr>
+        <w:pStyle w:val="Heading1"/>
         <w:spacing w:after="160" w:line="360" w:lineRule="auto"/>
         <w:jc w:val="both"/>
         <w:rPr>
@@ -3254,7 +3247,7 @@
           <w:szCs w:val="32"/>
           <w:rtl w:val="0"/>
         </w:rPr>
-        <w:t xml:space="preserve">V. DISCUSSION</w:t>
+        <w:t>Discussion</w:t>
       </w:r>
       <w:r>
         <w:rPr>
@@ -3297,7 +3290,7 @@
           <w:szCs w:val="28"/>
           <w:rtl w:val="0"/>
         </w:rPr>
-        <w:t xml:space="preserve">A. Performance of the Model Performance</w:t>
+        <w:t>A. Model Performance</w:t>
       </w:r>
       <w:r>
         <w:rPr>
@@ -3343,7 +3336,7 @@
         </w:rPr>
       </w:pPr>
       <w:r>
-        <w:t>Cross-validation stability was strong across four models, with AUC standard deviations below 0.026. KNN was the exception with SD=0.043, indicating higher sensitivity to the specific composition of each fold — likely a consequence of its instance-based learning being more affected by the SMOTE synthetic samples in training folds. The consistent performance across folds validates the robustness of the CRISP-DM pipeline.</w:t>
+        <w:t>Cross-validation stability was strong across four models, with AUC standard deviations below 0.041. KNN was the exception with SD=0.043, indicating higher sensitivity to the specific composition of each fold — likely a consequence of its instance-based learning being more affected by the SMOTE synthetic samples in training folds. The consistent performance across folds validates the robustness of the CRISP-DM pipeline.</w:t>
       </w:r>
     </w:p>
     <w:p>
@@ -3400,7 +3393,7 @@
           <w:szCs w:val="24"/>
           <w:rtl w:val="0"/>
         </w:rPr>
-        <w:t xml:space="preserve">The concept of adversarial testing presented here, although not completely automated, is also an incremental change to the existing literature. By considering noise injection at 5 % and 10 % of the feature standard deviation, the study admits the need for robustness tests in real-world applications, where noisy input data or incomplete input data may occur. Increased use of this test in the future will promote the credibility of the pipeline [33].</w:t>
+        <w:t>The conceptual adversarial validation protocol described in this study — injecting Gaussian noise at 5% and 10% of each feature's standard deviation — represents an incremental contribution relative to existing literature. While not fully implemented as an automated pipeline in this study, the design acknowledges the need for robustness testing in real-world deployments where input data may be noisy or incomplete. Full implementation is identified as a priority for future work [33].</w:t>
       </w:r>
     </w:p>
     <w:p>
@@ -3537,11 +3530,12 @@
           <w:szCs w:val="24"/>
           <w:rtl w:val="0"/>
         </w:rPr>
-        <w:t xml:space="preserve">Based on this, there are several extensions that are justified. The pipeline is supposed to be tested on the full UCI repository (subsets Hungarian, Swiss, Long Beach VA) to evaluate cross-population robustness. Multi-class classification has the potential to recover the baseline severity grades of the diseases and offer finer risk profiles. GRID search Hyperparameter tuning may further optimize each of the classifiers, and the adversarial robustness test should be completely automated to measure the resilience of a model. Going on explainability, the incorporation of counterfactual explanations would provide a response to the clinician based on the analysis of the causes and effects of stress on an individual [37].</w:t>
-      </w:r>
-    </w:p>
-    <w:p>
-      <w:pPr>
+        <w:t>Based on this, there are several extensions that are justified. The pipeline is should be validated on the full UCI repository (subsets Hungarian, Swiss, Long Beach VA) to evaluate cross-population robustness. Multi-class classification has the potential to recover the baseline severity grades of the diseases and offer finer risk profiles. GRID search Hyperparameter tuning may further optimize each of the classifiers, and the adversarial robustness test should be completely automated to measure the resilience of a model. Going on explainability, the incorporation of counterfactual explanations would provide a response to the clinician based on the analysis of the causes and effects of stress on an individual [37].</w:t>
+      </w:r>
+    </w:p>
+    <w:p>
+      <w:pPr>
+        <w:pStyle w:val="Heading1"/>
         <w:spacing w:after="160" w:line="360" w:lineRule="auto"/>
         <w:jc w:val="both"/>
         <w:rPr>
@@ -3557,7 +3551,7 @@
           <w:szCs w:val="32"/>
           <w:rtl w:val="0"/>
         </w:rPr>
-        <w:t xml:space="preserve">VI. CONCLUSION</w:t>
+        <w:t>Conclusion</w:t>
       </w:r>
       <w:r>
         <w:rPr>

</xml_diff>